<commit_message>
Small business article: HubSpot claim matched to current product page
Co-Authored-By: Claude Opus 5.5 <noreply@anthropic.com>
Claude-Session: https://claude.ai/code/session_01GQXcnZLn4f9MkUS7SEqp5J
</commit_message>
<xml_diff>
--- a/blog-content/AI-Content-Writing-for-Small-Business-FINAL.docx
+++ b/blog-content/AI-Content-Writing-for-Small-Business-FINAL.docx
@@ -962,7 +962,7 @@
         </w:rPr>
         <w:t xml:space="preserve"> the Office for National Statistics found </w:t>
       </w:r>
-      <w:hyperlink w:history="1" r:id="rId1kza0lctnxpi1suyoesyi">
+      <w:hyperlink w:history="1" r:id="rIdby9upz4ehaih0qjwsxqi1">
         <w:r>
           <w:rPr>
             <w:rStyle w:val="Hyperlink"/>
@@ -1013,7 +1013,7 @@
         </w:rPr>
         <w:t xml:space="preserve"> the British Chambers of Commerce reported in March 2026 that </w:t>
       </w:r>
-      <w:hyperlink w:history="1" r:id="rId_hpyut_tqqmh9nj6tmegf">
+      <w:hyperlink w:history="1" r:id="rId_uvma4ta4fipp8npmsh0l">
         <w:r>
           <w:rPr>
             <w:rStyle w:val="Hyperlink"/>
@@ -1064,7 +1064,7 @@
         </w:rPr>
         <w:t xml:space="preserve"> the U.S. Chamber of Commerce found that </w:t>
       </w:r>
-      <w:hyperlink w:history="1" r:id="rIden2smlwcrftjdu8hsyaci">
+      <w:hyperlink w:history="1" r:id="rIdxymk0dpn1v_uidwym4ymu">
         <w:r>
           <w:rPr>
             <w:rStyle w:val="Hyperlink"/>
@@ -1114,7 +1114,7 @@
         </w:rPr>
         <w:t xml:space="preserve">There's also a warning in the marketing data. HubSpot's </w:t>
       </w:r>
-      <w:hyperlink w:history="1" r:id="rIdhtqfoktvogwapvscxmbgu">
+      <w:hyperlink w:history="1" r:id="rId2pi2fdijd07azelweycbb">
         <w:r>
           <w:rPr>
             <w:rStyle w:val="Hyperlink"/>
@@ -1206,7 +1206,7 @@
         </w:rPr>
         <w:t xml:space="preserve">The fairest comparison is with hiring a writer. The 2026 ProCopywriters survey of 383 UK freelance copywriters puts the </w:t>
       </w:r>
-      <w:hyperlink w:history="1" r:id="rIdxlgjdo2bulnlsyovgar6-">
+      <w:hyperlink w:history="1" r:id="rId4y8gjkdfuhpfx1jmwmpfg">
         <w:r>
           <w:rPr>
             <w:rStyle w:val="Hyperlink"/>
@@ -1242,7 +1242,7 @@
         </w:rPr>
         <w:t xml:space="preserve">Per-article freelance rates and what the ranking data says about AI versus human writing are covered in </w:t>
       </w:r>
-      <w:hyperlink w:history="1" r:id="rIdz8_4p9okqrw_oaar99x0-">
+      <w:hyperlink w:history="1" r:id="rId5u5akybn3prb0_uvpbz6f">
         <w:r>
           <w:rPr>
             <w:rStyle w:val="Hyperlink"/>
@@ -1411,7 +1411,7 @@
         </w:rPr>
         <w:t xml:space="preserve"> my first choice for writing. It follows long, detailed instructions consistently, which matters when you want every draft to sound like your business. I compare it with the alternatives in </w:t>
       </w:r>
-      <w:hyperlink w:history="1" r:id="rIdoxfwgpnplxpne1rxi95xg">
+      <w:hyperlink w:history="1" r:id="rIdzsmrs4p9qjgvgrhzbpn_t">
         <w:r>
           <w:rPr>
             <w:rStyle w:val="Hyperlink"/>
@@ -1491,7 +1491,7 @@
         </w:rPr>
         <w:t xml:space="preserve"> its built-in assistant, </w:t>
       </w:r>
-      <w:hyperlink w:history="1" r:id="rIdglyfrbdamfkkuemkmyzkd">
+      <w:hyperlink w:history="1" r:id="rIdexbgpfbtyfk9ax9c2pe-j">
         <w:r>
           <w:rPr>
             <w:rStyle w:val="Hyperlink"/>
@@ -1540,9 +1540,9 @@
           <w:sz w:val="24"/>
           <w:szCs w:val="24"/>
         </w:rPr>
-        <w:t xml:space="preserve"> the </w:t>
-      </w:r>
-      <w:hyperlink w:history="1" r:id="rIdtqjqv2n9k21jwama0lz4c">
+        <w:t xml:space="preserve"> its </w:t>
+      </w:r>
+      <w:hyperlink w:history="1" r:id="rId7baue0nscmul-kb1yl9bl">
         <w:r>
           <w:rPr>
             <w:rStyle w:val="Hyperlink"/>
@@ -1552,7 +1552,7 @@
             <w:szCs w:val="24"/>
             <w:u w:val="single"/>
           </w:rPr>
-          <w:t xml:space="preserve">Breeze Content Agent</w:t>
+          <w:t xml:space="preserve">Content Hub</w:t>
         </w:r>
       </w:hyperlink>
       <w:r>
@@ -1562,7 +1562,7 @@
           <w:sz w:val="24"/>
           <w:szCs w:val="24"/>
         </w:rPr>
-        <w:t xml:space="preserve"> drafts blog posts and landing pages from your business context. It's included in Content Hub Professional and Enterprise, so it suits businesses already paying for HubSpot.</w:t>
+        <w:t xml:space="preserve"> has built-in AI for drafting blog posts and landing pages, and even the free plan includes AI blog post creation. It suits businesses already using HubSpot as their CRM.</w:t>
       </w:r>
     </w:p>
     <w:p>
@@ -1665,7 +1665,7 @@
         </w:rPr>
         <w:t xml:space="preserve">Start with one assistant. Add another only when you hit a job the first one does badly. To see what a structured blog draft looks like before you set anything up, try the free </w:t>
       </w:r>
-      <w:hyperlink w:history="1" r:id="rIdvxfbo64dgu-6t1fzhchmg">
+      <w:hyperlink w:history="1" r:id="rIdesbhsq23zcj-ctsgnr1g7">
         <w:r>
           <w:rPr>
             <w:rStyle w:val="Hyperlink"/>
@@ -1790,7 +1790,7 @@
         </w:rPr>
         <w:t xml:space="preserve">This is the single change that improved my drafts most. According to Anthropic's help centre, </w:t>
       </w:r>
-      <w:hyperlink w:history="1" r:id="rIdjqxkakmim_rcfy19cmjrj">
+      <w:hyperlink w:history="1" r:id="rIdws7rnacdnffv4pgczlyfo">
         <w:r>
           <w:rPr>
             <w:rStyle w:val="Hyperlink"/>
@@ -1918,7 +1918,7 @@
         </w:rPr>
         <w:t xml:space="preserve">You can go a step further with </w:t>
       </w:r>
-      <w:hyperlink w:history="1" r:id="rIdlhb1z8tll8id-9otqpttz">
+      <w:hyperlink w:history="1" r:id="rIdjpxiqc7vtclez8itshroz">
         <w:r>
           <w:rPr>
             <w:rStyle w:val="Hyperlink"/>
@@ -2103,7 +2103,7 @@
         </w:rPr>
         <w:t xml:space="preserve">Aim for one blog post a week answering one of those questions, two Google Business Profile posts a week and one email every fortnight. Turn each blog post into three social captions. Before publishing any blog post, write a clear title and check it's under 60 characters; my guide to </w:t>
       </w:r>
-      <w:hyperlink w:history="1" r:id="rId6i49yenye39wr2km0ylbf">
+      <w:hyperlink w:history="1" r:id="rIdu63y5vhcgp-cth4b4igtt">
         <w:r>
           <w:rPr>
             <w:rStyle w:val="Hyperlink"/>
@@ -2125,7 +2125,7 @@
         </w:rPr>
         <w:t xml:space="preserve"> covers how. For the drafting process itself, follow the </w:t>
       </w:r>
-      <w:hyperlink w:history="1" r:id="rIdulxocgl-pglcz76boj8kw">
+      <w:hyperlink w:history="1" r:id="rIdcxmt7g11lhmykxsztiee_">
         <w:r>
           <w:rPr>
             <w:rStyle w:val="Hyperlink"/>
@@ -2208,7 +2208,7 @@
         </w:rPr>
         <w:t xml:space="preserve">Get your basics right in normal Google Search first. Google says its AI Overviews and AI Mode have </w:t>
       </w:r>
-      <w:hyperlink w:history="1" r:id="rIdfuabyqf8wmez5g6ngcgph">
+      <w:hyperlink w:history="1" r:id="rIdls3kpjqzzsytnxp2nbd-u">
         <w:r>
           <w:rPr>
             <w:rStyle w:val="Hyperlink"/>
@@ -2434,7 +2434,7 @@
         </w:rPr>
         <w:t xml:space="preserve"> A generic draft reads like every competitor's generic draft. Add a photo, a price, a customer question or a real result to every piece. </w:t>
       </w:r>
-      <w:hyperlink w:history="1" r:id="rIdmvhxw311tlksgldleritt">
+      <w:hyperlink w:history="1" r:id="rId-b9kquyfftiogakztgf6o">
         <w:r>
           <w:rPr>
             <w:rStyle w:val="Hyperlink"/>
@@ -2485,7 +2485,7 @@
         </w:rPr>
         <w:t xml:space="preserve"> Google's spam policies target large volumes of low-value pages, whatever tool made them. Publish at the pace you can check. I cover what Google does and doesn't detect in </w:t>
       </w:r>
-      <w:hyperlink w:history="1" r:id="rIdemrkbamqhgobpay4lwqka">
+      <w:hyperlink w:history="1" r:id="rIdlpgxoe4l-dfoahq_jpvsi">
         <w:r>
           <w:rPr>
             <w:rStyle w:val="Hyperlink"/>
@@ -2546,7 +2546,7 @@
         </w:rPr>
         <w:t xml:space="preserve">Only if your use of that tool meets your data protection law (UK GDPR and EU GDPR, for example), and the safest habit is not to paste names, emails, order details or health information at all. Check each provider's settings on whether your chats are used for training, and, in the UK, read the ICO's </w:t>
       </w:r>
-      <w:hyperlink w:history="1" r:id="rIdpwmw2qf7e7c2k38uzanv9">
+      <w:hyperlink w:history="1" r:id="rIdvu0jqimxzvddc6ftjcyk7">
         <w:r>
           <w:rPr>
             <w:rStyle w:val="Hyperlink"/>
@@ -2599,7 +2599,7 @@
         </w:rPr>
         <w:t xml:space="preserve">Yes, and many small businesses do for social posts and blog headers. Avoid images that look like real customers, staff or other brands, and never use one to show a product or job result it doesn't match. If you sell online, Google's </w:t>
       </w:r>
-      <w:hyperlink w:history="1" r:id="rIdciegbjxkrzif6prla37vt">
+      <w:hyperlink w:history="1" r:id="rIddlrpowxhe6hqftbw9i6wz">
         <w:r>
           <w:rPr>
             <w:rStyle w:val="Hyperlink"/>
@@ -2728,7 +2728,7 @@
         </w:rPr>
         <w:t xml:space="preserve">For the bigger picture on tools, SEO and Google's rules, start with our </w:t>
       </w:r>
-      <w:hyperlink w:history="1" r:id="rIdnmbcb-fcysbm-btex5nf9">
+      <w:hyperlink w:history="1" r:id="rIdb4dtxo9mafsxxxis2uc3g">
         <w:r>
           <w:rPr>
             <w:rStyle w:val="Hyperlink"/>

</xml_diff>